<commit_message>
Replace the gate pseudocode with two equations
The verbatim code block overflowed the column. Eq. (gate_binary) and
(gate_threeway) state the same rules; the significance-aware condition now
refers to the binary equation. Letter: 'pseudocode' -> equations (R1 C2, C3).

Co-Authored-By: Claude Opus 5.5 <noreply@anthropic.com>
Claude-Session: https://claude.ai/code/session_01Pn1eqMqk9RYbEpVVX5vETL
</commit_message>
<xml_diff>
--- a/claude_context_notes/Nayak_Response-to-Reviewers_2.docx
+++ b/claude_context_notes/Nayak_Response-to-Reviewers_2.docx
@@ -207,7 +207,7 @@
         <w:rPr>
           <w:b/>
         </w:rPr>
-        <w:t>Author action: The gate now escalates only if the paired-bootstrap 95% interval on the verifier's accuracy gap over the stronger cheap detector lies entirely above zero (Section VI.I, with pseudocode). On held-out test sets this lowers harmful escalations from 7.3% to 0.3% at N = 50. It also misses more beneficial escalations (14-18% of draws, against 2-9% for the point-estimate rule), so the paper presents the two rules as a trade-off between the two kinds of error. We also audited the agreement path on every dataset. In-domain it is 96.8-99.8% accurate. Under the SDXL/FLUX shift it falls to 83.9-91.8%, and 8.2-16.1% of agreement-path inputs are errors both cheap detectors share, four to eight times the in-domain rate. Section VI.I and the Limitations report these results.</w:t>
+        <w:t>Author action: The gate now escalates only if the paired-bootstrap 95% interval on the verifier's accuracy gap over the stronger cheap detector lies entirely above zero (Section VI.I). On held-out test sets this lowers harmful escalations from 7.3% to 0.3% at N = 50. It also misses more beneficial escalations (14-18% of draws, against 2-9% for the point-estimate rule), so the paper presents the two rules as a trade-off between the two kinds of error. We also audited the agreement path on every dataset. In-domain it is 96.8-99.8% accurate. Under the SDXL/FLUX shift it falls to 83.9-91.8%, and 8.2-16.1% of agreement-path inputs are errors both cheap detectors share, four to eight times the in-domain rate. Section VI.I and the Limitations report these results.</w:t>
       </w:r>
     </w:p>
     <w:p>
@@ -255,7 +255,7 @@
         <w:rPr>
           <w:b/>
         </w:rPr>
-        <w:t>Author action: Section VI.I now gives pseudocode for both rules and states that they choose the same action in every case. The only difference was in our evaluation: the binary analysis checked the escalate-or-fallback decision, while the three-way analysis also checked which cheap detector was chosen. At N = 10, the resampled accuracies of the two cheap detectors can tie or reverse, which changes the chosen cheap detector without changing the escalation decision. Two configurations account for the whole N = 10 gap (13 vs. 11 of 35), and it disappears by N = 20. Section VI.I.3 now describes the three-way rule as reporting the selected detector explicitly, not as a different decision.</w:t>
+        <w:t>Author action: Section VI.I now defines both rules as equations and states that they choose the same action in every case. The only difference was in our evaluation: the binary analysis checked the escalate-or-fallback decision, while the three-way analysis also checked which cheap detector was chosen. At N = 10, the resampled accuracies of the two cheap detectors can tie or reverse, which changes the chosen cheap detector without changing the escalation decision. Two configurations account for the whole N = 10 gap (13 vs. 11 of 35), and it disappears by N = 20. Section VI.I.3 now describes the three-way rule as reporting the selected detector explicitly, not as a different decision.</w:t>
       </w:r>
     </w:p>
     <w:p>

</xml_diff>

<commit_message>
Retitle: 'On Reliable Frame-Level Detection of AI-Generated Multimedia Content'
R1 asked that the title acknowledge the video experiments use isolated frames.
Title and both running heads updated; letter Concern 11 now quotes R1's request
and reports the title change.

Co-Authored-By: Claude Opus 5.5 <noreply@anthropic.com>
Claude-Session: https://claude.ai/code/session_01Pn1eqMqk9RYbEpVVX5vETL
</commit_message>
<xml_diff>
--- a/claude_context_notes/Nayak_Response-to-Reviewers_2.docx
+++ b/claude_context_notes/Nayak_Response-to-Reviewers_2.docx
@@ -610,7 +610,7 @@
         <w:rPr>
           <w:b/>
         </w:rPr>
-        <w:t xml:space="preserve"> Disagreement does not identify input difficulty in general, and the video framing goes beyond what a frame-level study supports.</w:t>
+        <w:t xml:space="preserve"> Disagreement does not identify input difficulty in general. The title and conclusions should also acknowledge that the video experiments use isolated frames and do not validate temporal video forensics.</w:t>
       </w:r>
     </w:p>
     <w:p>
@@ -639,7 +639,7 @@
         <w:rPr>
           <w:b/>
         </w:rPr>
-        <w:t>Author action: We removed the difficulty framing throughout. The paper now says disagreement flags inputs on which a cheap detector is unreliable, and Section V.B notes that on GenBuster the semantic probe remains 96.1% accurate on the disagreement subset. The abstract, Limitations and Conclusion state that the study evaluates frame-level detection, not temporal video forensics.</w:t>
+        <w:t>Author action: We removed the difficulty framing throughout. The paper now says disagreement flags inputs on which a cheap detector is unreliable, and Section V.B notes that on GenBuster the semantic probe remains 96.1% accurate on the disagreement subset. We changed the title to “On Reliable Frame-Level Detection of AI-Generated Multimedia Content.” The abstract, Limitations and Conclusion state that all experiments, including those on video, use isolated frames and do not validate temporal video forensics.</w:t>
       </w:r>
     </w:p>
     <w:p>

</xml_diff>

<commit_message>
Letter: shorten every Author action (1,634 -> 1,080 words)
Each action now states the change and where it is, with the same numbers and
section pointers. Written to the writer-skill rules: no em dashes, no 'not X
but Y'/'rather than' contrasts, no stacked transitions, straight quotes. The
Concern 4 response is reworded for the same reason.

Co-Authored-By: Claude Opus 5.5 <noreply@anthropic.com>
Claude-Session: https://claude.ai/code/session_01Pn1eqMqk9RYbEpVVX5vETL
</commit_message>
<xml_diff>
--- a/claude_context_notes/Nayak_Response-to-Reviewers_2.docx
+++ b/claude_context_notes/Nayak_Response-to-Reviewers_2.docx
@@ -159,7 +159,7 @@
         <w:rPr>
           <w:b/>
         </w:rPr>
-        <w:t>Author action: We added a held-out evaluation in Section VI.I.1. For each configuration we split the disagreement subset into disjoint calibration and test sets (250 draws at N = 50, 100 and 200, and at half the pool), freeze the gate's decision on the calibration set, and score it against the test set's own oracle. Two BigGAN configurations have only 14 disagreement samples and are excluded, leaving 33. With the significance-aware rule from Concern 2, the gate reaches at least 90% agreement in 17 of 33 configurations at N = 50, 21 at N = 100 and 25 at N = 200, below the same-pool figures. We now recommend N ≈ 200 or the full available pool, and state that close-margin configurations can remain unreliable even then. The gate-reliability table reports the held-out results next to the same-pool results, notes where N is capped at half of a small pool, and shows how often the gate enables escalation on the four SDXL/FLUX configurations behind our positive result. FLUX/SigLIP2, the one with the smallest margin, escalates in only 63% of draws at N = 100.</w:t>
+        <w:t>Author action: We added a held-out evaluation (Section VI.I.1). For each configuration, the gate's decision is fixed on a calibration split of the disagreement subset and scored against a disjoint test split. Two BigGAN configurations with only 14 disagreement samples are excluded. With the significance-aware rule, the gate reaches at least 90% agreement in 21 of 33 configurations at N = 100 and 25 of 33 at N = 200, below the same-pool figures, so we now recommend N ≈ 200 or the full pool. The gate table also shows how often the gate escalates on the four positive SDXL/FLUX configurations; FLUX/SigLIP2 escalates in only 63% of draws at N = 100.</w:t>
       </w:r>
     </w:p>
     <w:p>
@@ -207,7 +207,7 @@
         <w:rPr>
           <w:b/>
         </w:rPr>
-        <w:t>Author action: The gate now escalates only if the paired-bootstrap 95% interval on the verifier's accuracy gap over the stronger cheap detector lies entirely above zero (Section VI.I). On held-out test sets this lowers harmful escalations from 7.3% to 0.3% at N = 50. It also misses more beneficial escalations (14-18% of draws, against 2-9% for the point-estimate rule), so the paper presents the two rules as a trade-off between the two kinds of error. We also audited the agreement path on every dataset. In-domain it is 96.8-99.8% accurate. Under the SDXL/FLUX shift it falls to 83.9-91.8%, and 8.2-16.1% of agreement-path inputs are errors both cheap detectors share, four to eight times the in-domain rate. Section VI.I and the Limitations report these results.</w:t>
+        <w:t>Author action: The gate now escalates only if the paired-bootstrap 95% interval on the verifier's gain over the stronger cheap detector lies above zero (Section VI.I). On held-out splits this lowers harmful escalations from 7.3% to 0.3% at N = 50 and raises missed beneficial escalations, and the paper presents the two rules as a trade-off. An agreement-path audit on every dataset finds errors shared by both cheap detectors on 0.2-3.2% of agreement-path inputs in-domain and 8.2-16.1% under the SDXL/FLUX shift.</w:t>
       </w:r>
     </w:p>
     <w:p>
@@ -255,7 +255,7 @@
         <w:rPr>
           <w:b/>
         </w:rPr>
-        <w:t>Author action: Section VI.I now defines both rules as equations and states that they choose the same action in every case. The only difference was in our evaluation: the binary analysis checked the escalate-or-fallback decision, while the three-way analysis also checked which cheap detector was chosen. At N = 10, the resampled accuracies of the two cheap detectors can tie or reverse, which changes the chosen cheap detector without changing the escalation decision. Two configurations account for the whole N = 10 gap (13 vs. 11 of 35), and it disappears by N = 20. Section VI.I.3 now describes the three-way rule as reporting the selected detector explicitly, not as a different decision.</w:t>
+        <w:t>Author action: Section VI.I now defines both rules as equations and states that they always choose the same action. The N = 10 gap (13 vs. 11 of 35) comes from two configurations where resampled cheap-detector accuracies tie or reverse, which changes the chosen cheap detector but not the escalation decision. It disappears by N = 20.</w:t>
       </w:r>
     </w:p>
     <w:p>
@@ -291,7 +291,7 @@
       </w:r>
       <w:r>
         <w:rPr/>
-        <w:t>We agree that this had to be shown rather than argued. The original images turned out to carry a confound that affects every detector, not only GPT-5.5.</w:t>
+        <w:t>We agree that this needed evidence. The original images carry a confound that affects the FFT detector as much as GPT-5.5.</w:t>
       </w:r>
     </w:p>
     <w:p>
@@ -303,7 +303,7 @@
         <w:rPr>
           <w:b/>
         </w:rPr>
-        <w:t>Author action: Section IV.B and a new table report the full cascade on the original PASCAL VOC images and on COCO val2017, an independent source, alongside the ImageNet benchmark. Escalating to GPT-5.5 improves on the stale semantic probe under all three sources: by 2.5-5.5 points on PASCAL VOC, 4.1-9.0 on COCO and 3.4-7.9 on ImageNet. Under PASCAL VOC the whole cascade degrades (72.9-77.9% accuracy) because the FFT detector also labels 83-85% of these photographs fake. The bundled PASCAL VOC images are all 256×256 while every fake is 1,024×1,024, so image size alone separates the two classes. We no longer recommend replacing compressed photographs in general.</w:t>
+        <w:t>Author action: Section IV.B and Table 2 report the full cascade on the original PASCAL VOC images and on COCO val2017. Escalation improves on the stale probe under all three real-image sources: by 2.5-5.5 points on PASCAL VOC, 4.1-9.0 on COCO and 3.4-7.9 on ImageNet. On PASCAL VOC the FFT detector also labels 83-85% of the photographs fake, and image size alone separates the classes (256×256 real, 1,024×1,024 fake). We no longer recommend replacing compressed photographs in general.</w:t>
       </w:r>
     </w:p>
     <w:p>
@@ -351,7 +351,7 @@
         <w:rPr>
           <w:b/>
         </w:rPr>
-        <w:t>Author action: We rebuilt both from one probe snapshot with complete GPT-5.5 coverage of the disagreement subsets. The corrected numbers reconcile, and they reverse one claim: real-class recall increases under escalation in all four configurations rather than declining (Section VI.G). We then checked every table and inline number against a single results pipeline and found other stale values. The GenBuster CLIP result came from a probe that had seen part of its evaluation set (see Concern 6), and the cheap-trigger, transfer, probe-degradation, cross-family and per-generator results came from older runs. All tables are now regenerated on the same evaluation sets. One result changed: the BigGAN→GenBuster cross-family pairing is now a small, significant gain over in-domain FFT (+3.0 points, 95% CI [+0.5, +5.5]) rather than a tie.</w:t>
+        <w:t>Author action: We rebuilt both from one probe snapshot with complete GPT-5.5 coverage. The numbers now reconcile, and real-class recall increases under escalation in all four configurations (Section VI.G). An audit of every table against one results pipeline also replaced stale values in the GenBuster CLIP result and several other tables. One result changed: BigGAN→GenBuster is now a small significant gain over in-domain FFT (+3.0 points, 95% CI [+0.5, +5.5]).</w:t>
       </w:r>
     </w:p>
     <w:p>
@@ -399,7 +399,7 @@
         <w:rPr>
           <w:b/>
         </w:rPr>
-        <w:t>Author action: Section V.A now describes the actual split: a stratified evaluation set of fixed size (1,000 for GenBuster, whose full pool is 2,000; 2,000 each for SD 1.4 and BigGAN, from 12,000-image pools), with every detector trained on the rest of the pool and no nested validation split. Checking this exposed a leak: the GenBuster CLIP probe had not been retrained after the evaluation set was expanded, so about 40% of its evaluation images were in its training data. It is now retrained. We also checked real-image reuse. All SDXL and FLUX real images come from the SD 1.4 real pool, and about a third of SD 1.4's evaluation real images also appear in the SDXL/FLUX real class. Section V.A discloses this, and the split lists are released with the code.</w:t>
+        <w:t>Author action: Section V.A now describes the actual split: a fixed stratified evaluation set (1,000 for GenBuster, 2,000 each for SD 1.4 and BigGAN), with every detector trained on the rest of the pool. This exposed a leak in the GenBuster CLIP probe, which had about 40% of its evaluation images in its training data; it is now retrained. Section V.A also discloses that all SDXL/FLUX real images come from the SD 1.4 real pool, overlapping about a third of SD 1.4's evaluation reals.</w:t>
       </w:r>
     </w:p>
     <w:p>
@@ -447,7 +447,7 @@
         <w:rPr>
           <w:b/>
         </w:rPr>
-        <w:t>Author action: Section IV.B.1 now documents the model identifier and API, the parameters left at their defaults, the output budget (2,048 tokens rising to 4,096 over up to five retries, since budgets under about 100 tokens truncate the answer), and the parser, which accepts only an exact REAL or FAKE and never defaults to a label. The previous version's code capped output at 16-100 tokens and mapped empty or truncated responses to a fixed label; we reran every affected call and corrected 19 SDXL/FLUX responses that had been mislabeled. Per-call timestamps exist only for the rerun calls and are released with the per-sample files. GPT-5.5 and Qwen coverage is now complete for every reported configuration, including the GenBuster and SD 1.4 disagreement subsets that were partial before. For the four SDXL/FLUX configurations, the verifier-subset table in Section V.B reports the subset size (1,452-1,675), its class composition, GPT-5.5 and best-cheap accuracy, and the paired 95% CI on the gap (+8.1 to +20.4 points).</w:t>
+        <w:t>Author action: Section IV.B.1 documents the model and API, the default parameters, the 2,048-4,096 token budget and the exact-match parser. The previous version's code capped output at 16-100 tokens and mapped empty or truncated responses to a fixed label; we reran every affected call and corrected 19 mislabeled SDXL/FLUX responses. Timestamps exist only for the rerun calls and are released. Coverage is now complete for every reported configuration. For the four SDXL/FLUX configurations, the verifier-subset table in Section V.B gives subset size (1,452-1,675), class composition, both accuracies and the paired 95% CI on the gap (+8.1 to +20.4 points).</w:t>
       </w:r>
     </w:p>
     <w:p>
@@ -495,7 +495,7 @@
         <w:rPr>
           <w:b/>
         </w:rPr>
-        <w:t>Author action: Section V.C adds a joint confidence baseline that escalates when the less confident of the two cheap probes is uncertain, with its threshold fit on held-out data to match the disagreement rule's escalation rate. Disagreement is more accurate in-domain on SD 1.4 and BigGAN and tied on GenBuster. Under the SDXL/FLUX shift the confidence rule is tied or better, by up to 1.7 points, and the cascade's gain over the stale probe is similar with either signal (3.6-7.7 points for confidence, 3.4-7.9 for disagreement). C4 and the conclusion now present disagreement as the simpler option, since it needs no threshold or probability outputs, rather than the more accurate one. The 0.917 in Table 11 could not be reproduced from current data. Recomputed, the learned classifier and the disagreement rule make identical predictions (0.899 vs. 0.899, paired CI [0.000, 0.000]). We renamed the bandit a learned escalation classifier and describe its features and training label in Section VI.C.</w:t>
+        <w:t>Author action: Section V.C adds a joint confidence baseline, with its threshold fit on held-out data at the disagreement rule's escalation rate. Disagreement is more accurate in-domain on SD 1.4 and BigGAN. Under the SDXL/FLUX shift the confidence rule is tied or up to 1.7 points better, and the cascade's gain is similar with either signal, so C4 now presents disagreement as the simplest signal. Recomputed on current data, the learned classifier and the disagreement rule make identical predictions (0.899 vs. 0.899, CI [0.000, 0.000]), and the 0.917 is withdrawn. The bandit is renamed a learned escalation classifier, with its features and training label in Section VI.C.</w:t>
       </w:r>
     </w:p>
     <w:p>
@@ -543,7 +543,7 @@
         <w:rPr>
           <w:b/>
         </w:rPr>
-        <w:t>Author action: A classifier given only image width and height reaches 99.55% on BigGAN, and passing the real images through the same downsampling as the fakes drops the trained FFT detector to 50.1% (Section VI.G). We added JPEG, blur and rescaling tests for all three cheap detectors. On SDXL/FLUX, a width-and-height classifier separates real from fake with 98.9-100% accuracy, so we repeated the deployment-shift evaluation with every image cropped and resized to 256×256, including a new GPT-5.5 run (Section V.B.2). The cascade's gain over the stale probe remains significant in all four configurations (3.9-7.1 points), and GPT-5.5 still beats the best cheap detector on every disagreement subset. GPT-5.5's own accuracy on all images falls by 2.6-3.3 points, so part of its strength on the original images came from size. On the BigGAN distant shift, the verifiers' accuracy also depends on input size, so we withdrew our earlier statement about model scale (Section V.D.6). Section IV.B now specifies the FFT/DCT features and classifier exactly, and Section II.A cites the dataset-shortcut analysis the reviewer pointed to.</w:t>
+        <w:t>Author action: On BigGAN, width and height alone give 99.55% accuracy, and matching resolution across classes drops the FFT detector to 50.1% (Section VI.G). We added JPEG, blur and rescaling tests for the cheap detectors. SDXL/FLUX has the same kind of shortcut (98.9-100% from size alone), so Section V.B.2 repeats that evaluation with every image resized to 256×256. The cascade's gain stays significant in all four configurations (3.9-7.1 points), while GPT-5.5's own accuracy falls 2.6-3.3 points. Section IV.B specifies the FFT/DCT features exactly, and Section II.A cites the shortcut analysis the reviewer pointed to. Because the verifier ranking on the BigGAN shift changes with input size, we also withdrew our model-scale claim (Section V.D.6).</w:t>
       </w:r>
     </w:p>
     <w:p>
@@ -591,7 +591,7 @@
         <w:rPr>
           <w:b/>
         </w:rPr>
-        <w:t>Author action: We ran GPT-5.5 on every SDXL and FLUX image. Section VI.J and the deployment-shift table now compare the stale probe, the cascade and GPT-5.5 on every input, with costs computed from measured token counts at the Batch price. GPT-5.5 on every input reaches 99.6% on SDXL and 97.1% on FLUX. The cascade reaches 89.3-94.0% at 42-51% of that cost, leaving 3.0-7.8 points of accuracy behind. The paper states this gap and when the saving is worth it (high volume, rate limits, self-hosted verifiers). Section VI.J also reports mean tokens per call for every dataset.</w:t>
+        <w:t>Author action: We ran GPT-5.5 on every SDXL and FLUX image. Section VI.J and Table 5 compare the stale probe, the cascade and GPT-5.5 on every input, with costs from measured tokens at the Batch price. GPT-5.5 alone reaches 99.6% on SDXL and 97.1% on FLUX; the cascade reaches 89.3-94.0% at 42-51% of the cost. The paper states this 3.0-7.8 point gap and when the saving is worth it.</w:t>
       </w:r>
     </w:p>
     <w:p>
@@ -639,7 +639,7 @@
         <w:rPr>
           <w:b/>
         </w:rPr>
-        <w:t>Author action: We removed the difficulty framing throughout. The paper now says disagreement flags inputs on which a cheap detector is unreliable, and Section V.B notes that on GenBuster the semantic probe remains 96.1% accurate on the disagreement subset. We changed the title to “On Reliable Frame-Level Detection of AI-Generated Multimedia Content.” The abstract, Limitations and Conclusion state that all experiments, including those on video, use isolated frames and do not validate temporal video forensics.</w:t>
+        <w:t>Author action: We changed the title to "On Reliable Frame-Level Detection of AI-Generated Multimedia Content." The abstract, Limitations and Conclusion state that all experiments use isolated frames and do not validate temporal video forensics. The difficulty wording is gone: the paper says disagreement flags inputs where a cheap detector is unreliable, and notes that the semantic probe stays 96.1% accurate on GenBuster's disagreement subset.</w:t>
       </w:r>
     </w:p>
     <w:p>
@@ -687,7 +687,7 @@
         <w:rPr>
           <w:b/>
         </w:rPr>
-        <w:t>Author action: C2 now says we evaluate, rather than propose, the routing rule, and the contributions are stated as empirical findings.</w:t>
+        <w:t>Author action: C2 now says we evaluate the routing rule, and the contributions are stated as empirical findings.</w:t>
       </w:r>
     </w:p>
     <w:p>
@@ -735,7 +735,7 @@
         <w:rPr>
           <w:b/>
         </w:rPr>
-        <w:t>Author action: The caption of the gate-reliability table in Section VI.I now states that for disagreement subsets under 200 samples, the larger N values resample with replacement and do not stand in for independent labeled examples.</w:t>
+        <w:t>Author action: The gate table caption now states that for subsets under 200 samples, larger N resample with replacement and add no independent labels.</w:t>
       </w:r>
     </w:p>
     <w:p>
@@ -783,7 +783,7 @@
         <w:rPr>
           <w:b/>
         </w:rPr>
-        <w:t>Author action: Section V.B now states that on GenBuster the semantic probe remains 96.1% accurate on the disagreement subset, so disagreement mainly flags inputs where the artifact detector fails, and escalating to a weaker verifier replaces correct semantic predictions.</w:t>
+        <w:t>Author action: Section V.B now says the semantic probe stays 96.1% accurate on GenBuster's disagreement subset, so disagreement there flags artifact-detector failure, and escalating to a weaker verifier replaces correct predictions.</w:t>
       </w:r>
     </w:p>
     <w:p>
@@ -831,7 +831,7 @@
         <w:rPr>
           <w:b/>
         </w:rPr>
-        <w:t>Author action: Section V.D.1 now gives the result per dataset, recomputed on the main evaluation sets. The gain is substantial only on SD 1.4 (0.874 vs. 0.833), small on BigGAN (0.995 vs. 0.990, near ceiling) and absent on GenBuster (0.899 vs. 0.900).</w:t>
+        <w:t>Author action: Section V.D.1 now reports the result per dataset: a clear gain on SD 1.4 (0.874 vs. 0.833), a small one on BigGAN (0.995 vs. 0.990, near ceiling) and none on GenBuster (0.899 vs. 0.900).</w:t>
       </w:r>
     </w:p>
     <w:p>
@@ -879,7 +879,7 @@
         <w:rPr>
           <w:b/>
         </w:rPr>
-        <w:t>Author action: Section VI.B now includes this table, with the count of each case for every experimental setting. A configuration counts as Case 3 only if the verifier beats the best cheap detector on its disagreement subset with a 95% CI above zero, which six configurations do.</w:t>
+        <w:t>Author action: Section VI.B adds this table. A configuration counts as Case 3 only if the verifier beats the best cheap detector on its disagreement subset with a 95% CI above zero, and six configurations do.</w:t>
       </w:r>
     </w:p>
     <w:sectPr>

</xml_diff>